<commit_message>
Update Playwright project documentation
Co-Authored-By: Claude Sonnet 4.6 <noreply@anthropic.com>
</commit_message>
<xml_diff>
--- a/PLAYWRIGHTAUTOMATION/Dokumentacja projektowa.docx
+++ b/PLAYWRIGHTAUTOMATION/Dokumentacja projektowa.docx
@@ -14,21 +14,20 @@
         <w:t xml:space="preserve">Ustawiamy Zmienną środowiskową NODE_HOME = </w:t>
       </w:r>
       <w:r>
-        <w:t xml:space="preserve">C:\Program </w:t>
+        <w:t>C:\Program Files\nodejs</w:t>
       </w:r>
-      <w:proofErr w:type="spellStart"/>
+    </w:p>
+    <w:p>
+      <w:pPr>
+        <w:pStyle w:val="Akapitzlist"/>
+        <w:numPr>
+          <w:ilvl w:val="0"/>
+          <w:numId w:val="1"/>
+        </w:numPr>
+      </w:pPr>
       <w:r>
-        <w:t>Files</w:t>
+        <w:t>npm init playwright</w:t>
       </w:r>
-      <w:proofErr w:type="spellEnd"/>
-      <w:r>
-        <w:t>\</w:t>
-      </w:r>
-      <w:proofErr w:type="spellStart"/>
-      <w:r>
-        <w:t>nodejs</w:t>
-      </w:r>
-      <w:proofErr w:type="spellEnd"/>
     </w:p>
     <w:sectPr>
       <w:pgSz w:w="11906" w:h="16838"/>

</xml_diff>